<commit_message>
feat(demo 17/10): video T1–T4 thêm lại đoạn chọn thư mục (làm mờ tên tài khoản) và cảnh tệp kết quả; cập nhật kịch bản, gói gửi P-QLKHCN
Co-Authored-By: Claude Opus 5.5 <noreply@anthropic.com>
</commit_message>
<xml_diff>
--- a/30-Ket-Qua/2026-10-12/De-Mo-17-10/KICH-BAN-LOI-TRINH-BAY_17.10.2026.docx
+++ b/30-Ket-Qua/2026-10-12/De-Mo-17-10/KICH-BAN-LOI-TRINH-BAY_17.10.2026.docx
@@ -534,7 +534,7 @@
                 <w:i w:val="0"/>
                 <w:sz w:val="26"/>
               </w:rPr>
-              <w:t>Video T1 (45 giây)</w:t>
+              <w:t>Video T1 (01 phút 11 giây)</w:t>
             </w:r>
           </w:p>
         </w:tc>
@@ -554,7 +554,7 @@
                 <w:i w:val="0"/>
                 <w:sz w:val="26"/>
               </w:rPr>
-              <w:t>Để video chạy; nói chen ở nửa sau: “Công cụ đang đọc từng tệp, kiểm tra mẫu, thời hạn, sản phẩm.”</w:t>
+              <w:t>Để video chạy: Chọn thư mục dữ liệu, giao việc, công cụ làm việc, cuối video là tệp kết quả. Nói chen: “Công cụ đang đọc từng tệp, kiểm tra mẫu, thời hạn, sản phẩm.”</w:t>
             </w:r>
           </w:p>
         </w:tc>
@@ -720,7 +720,7 @@
                 <w:i w:val="0"/>
                 <w:sz w:val="26"/>
               </w:rPr>
-              <w:t>Trang trình chiếu 4, Video T2 (42 giây)</w:t>
+              <w:t>Trang trình chiếu 4, Video T2 (56 giây, cuối video là bảng đối chiếu)</w:t>
             </w:r>
           </w:p>
         </w:tc>
@@ -1135,7 +1135,7 @@
                 <w:i w:val="0"/>
                 <w:sz w:val="26"/>
               </w:rPr>
-              <w:t>Video T3 (43 giây)</w:t>
+              <w:t>Video T3 (01 phút 02 giây)</w:t>
             </w:r>
           </w:p>
         </w:tc>
@@ -1155,7 +1155,7 @@
                 <w:i w:val="0"/>
                 <w:sz w:val="26"/>
               </w:rPr>
-              <w:t>Để video chạy; nói chen: “Công cụ phát triển từ báo cáo tháng trước, giữ lời văn của cơ quan.”</w:t>
+              <w:t>Để video chạy, cuối video là dự thảo báo cáo và phụ lục đối chiếu; nói chen: “Công cụ phát triển từ báo cáo tháng trước, giữ lời văn của cơ quan.”</w:t>
             </w:r>
           </w:p>
         </w:tc>
@@ -1550,7 +1550,7 @@
                 <w:i w:val="0"/>
                 <w:sz w:val="26"/>
               </w:rPr>
-              <w:t>Trang trình chiếu 6, Video T4 (43 giây)</w:t>
+              <w:t>Trang trình chiếu 6, Video T4 (01 phút 01 giây, cuối video là báo cáo rà soát)</w:t>
             </w:r>
           </w:p>
         </w:tc>

</xml_diff>

<commit_message>
feat(demo 17/10): video T1–T4 có giọng thuyết minh phủ kín (lời dài, thêm điểm hay của từng chức năng), bỏ làm mờ; cập nhật kịch bản
Co-Authored-By: Claude Opus 5.5 <noreply@anthropic.com>
</commit_message>
<xml_diff>
--- a/30-Ket-Qua/2026-10-12/De-Mo-17-10/KICH-BAN-LOI-TRINH-BAY_17.10.2026.docx
+++ b/30-Ket-Qua/2026-10-12/De-Mo-17-10/KICH-BAN-LOI-TRINH-BAY_17.10.2026.docx
@@ -534,7 +534,7 @@
                 <w:i w:val="0"/>
                 <w:sz w:val="26"/>
               </w:rPr>
-              <w:t>Video T1 (01 phút 11 giây)</w:t>
+              <w:t>Video T1 (50 giây)</w:t>
             </w:r>
           </w:p>
         </w:tc>
@@ -554,7 +554,7 @@
                 <w:i w:val="0"/>
                 <w:sz w:val="26"/>
               </w:rPr>
-              <w:t>Để video chạy: Chọn thư mục dữ liệu, giao việc, công cụ làm việc, cuối video là tệp kết quả. Nói chen: “Công cụ đang đọc từng tệp, kiểm tra mẫu, thời hạn, sản phẩm.”</w:t>
+              <w:t>Không nói - video có giọng thuyết minh suốt: Chọn thư mục dữ liệu, giao việc, công cụ làm việc, cuối video là tệp kết quả.</w:t>
             </w:r>
           </w:p>
         </w:tc>
@@ -720,7 +720,7 @@
                 <w:i w:val="0"/>
                 <w:sz w:val="26"/>
               </w:rPr>
-              <w:t>Trang trình chiếu 4, Video T2 (56 giây, cuối video là bảng đối chiếu)</w:t>
+              <w:t>Trang trình chiếu 4, Video T2 (40 giây, cuối video là bảng đối chiếu)</w:t>
             </w:r>
           </w:p>
         </w:tc>
@@ -1135,7 +1135,7 @@
                 <w:i w:val="0"/>
                 <w:sz w:val="26"/>
               </w:rPr>
-              <w:t>Video T3 (01 phút 02 giây)</w:t>
+              <w:t>Video T3 (47 giây)</w:t>
             </w:r>
           </w:p>
         </w:tc>
@@ -1155,7 +1155,7 @@
                 <w:i w:val="0"/>
                 <w:sz w:val="26"/>
               </w:rPr>
-              <w:t>Để video chạy, cuối video là dự thảo báo cáo và phụ lục đối chiếu; nói chen: “Công cụ phát triển từ báo cáo tháng trước, giữ lời văn của cơ quan.”</w:t>
+              <w:t>Không nói - video có giọng thuyết minh; cuối video là dự thảo báo cáo và phụ lục đối chiếu.</w:t>
             </w:r>
           </w:p>
         </w:tc>
@@ -1550,7 +1550,7 @@
                 <w:i w:val="0"/>
                 <w:sz w:val="26"/>
               </w:rPr>
-              <w:t>Trang trình chiếu 6, Video T4 (01 phút 01 giây, cuối video là báo cáo rà soát)</w:t>
+              <w:t>Trang trình chiếu 6, Video T4 (43 giây, có giọng thuyết minh, cuối video là báo cáo rà soát)</w:t>
             </w:r>
           </w:p>
         </w:tc>

</xml_diff>

<commit_message>
feat(demo 17/10): video T4 chiếu lần lượt 08 trang báo cáo rà soát, lời mô tả từng trang; cập nhật kịch bản phần 3
Co-Authored-By: Claude Opus 5.5 <noreply@anthropic.com>
</commit_message>
<xml_diff>
--- a/30-Ket-Qua/2026-10-12/De-Mo-17-10/KICH-BAN-LOI-TRINH-BAY_17.10.2026.docx
+++ b/30-Ket-Qua/2026-10-12/De-Mo-17-10/KICH-BAN-LOI-TRINH-BAY_17.10.2026.docx
@@ -1550,7 +1550,7 @@
                 <w:i w:val="0"/>
                 <w:sz w:val="26"/>
               </w:rPr>
-              <w:t>Trang trình chiếu 6, Video T4 (43 giây, có giọng thuyết minh, cuối video là báo cáo rà soát)</w:t>
+              <w:t>Trang trình chiếu 6, Video T4 (02 phút 21 giây)</w:t>
             </w:r>
           </w:p>
         </w:tc>
@@ -1570,7 +1570,7 @@
                 <w:i w:val="0"/>
                 <w:sz w:val="26"/>
               </w:rPr>
-              <w:t>Văn bản rà soát là một dự thảo văn bản của Đảng đã đổi tên cơ quan, đổi cấp để ẩn danh. Công cụ tự nhận ra văn bản của Đảng, áp Hướng dẫn số 05-HD/VPTW, không áp Nghị định số 30/2020/NĐ-CP.</w:t>
+              <w:t>Giới thiệu trước khi bấm chạy: Văn bản rà soát là một dự thảo văn bản của Đảng đã đổi tên cơ quan, đổi cấp để ẩn danh. Công cụ tự nhận ra văn bản của Đảng, áp Hướng dẫn số 05-HD/VPTW, không áp Nghị định số 30/2020/NĐ-CP. Sau đó không nói - video chiếu lần lượt 08 trang báo cáo rà soát của lượt chạy trên Cowork, có lời mô tả từng trang, tự nêu phát hiện số 5 là chưa chính xác.</w:t>
             </w:r>
           </w:p>
         </w:tc>
@@ -1592,7 +1592,7 @@
                 <w:i w:val="0"/>
                 <w:sz w:val="26"/>
               </w:rPr>
-              <w:t>03:00</w:t>
+              <w:t>04:30</w:t>
             </w:r>
           </w:p>
         </w:tc>
@@ -1632,7 +1632,7 @@
                 <w:i w:val="0"/>
                 <w:sz w:val="26"/>
               </w:rPr>
-              <w:t>25 phát hiện, 0 Mức 1, 07 Mức 2. Chỉ 03 điểm: Chương trình của đảng ủy nhưng ký hiệu “/TU”; tên loại cỡ 14, quy định 15 - 16 (đo trên tệp thật); cụm “Ban Thường vụ Đảng ủy” không rõ là cấp nào.</w:t>
+              <w:t>So với lượt rà soát đầy đủ: 25 phát hiện, 0 Mức 1, 07 Mức 2. Chỉ 03 điểm: Chương trình của đảng ủy nhưng ký hiệu “/TU”; tên loại cỡ 14, quy định 15 - 16 (đo trên tệp thật); cụm “Ban Thường vụ Đảng ủy” không rõ là cấp nào.</w:t>
             </w:r>
           </w:p>
         </w:tc>
@@ -1654,7 +1654,7 @@
                 <w:i w:val="0"/>
                 <w:sz w:val="26"/>
               </w:rPr>
-              <w:t>05:00</w:t>
+              <w:t>06:00</w:t>
             </w:r>
           </w:p>
         </w:tc>
@@ -1674,7 +1674,7 @@
                 <w:i w:val="0"/>
                 <w:sz w:val="26"/>
               </w:rPr>
-              <w:t>Mở tệp 32 (lượt chạy nhanh trên Cowork)</w:t>
+              <w:t>Nói, không mở tệp</w:t>
             </w:r>
           </w:p>
         </w:tc>
@@ -1694,7 +1694,7 @@
                 <w:i w:val="0"/>
                 <w:sz w:val="26"/>
               </w:rPr>
-              <w:t>Cùng văn bản, lượt chạy nhanh chỉ ra 06 phát hiện, trong đó 01 phát hiện sai. Mỗi lượt có điểm mạnh, điểm sai - vì vậy rà soát chính thức phải chạy đủ quy trình và luôn có người kiểm tra.</w:t>
+              <w:t>Cùng văn bản, lượt chạy nhanh vừa xem chỉ ra 06 phát hiện, trong đó 01 phát hiện sai (tệp 32 để dự phòng). Mỗi lượt có điểm mạnh, điểm sai - vì vậy rà soát chính thức phải chạy đủ quy trình và luôn có người kiểm tra.</w:t>
             </w:r>
           </w:p>
         </w:tc>
@@ -1716,7 +1716,7 @@
                 <w:i w:val="0"/>
                 <w:sz w:val="26"/>
               </w:rPr>
-              <w:t>06:30</w:t>
+              <w:t>07:00</w:t>
             </w:r>
           </w:p>
         </w:tc>

</xml_diff>

<commit_message>
feat(demo 17/10): video T1–T3 chiếu lần lượt từng trang kết quả, lời mô tả từng trang (như T4); cập nhật kịch bản
Co-Authored-By: Claude Opus 5.5 <noreply@anthropic.com>
</commit_message>
<xml_diff>
--- a/30-Ket-Qua/2026-10-12/De-Mo-17-10/KICH-BAN-LOI-TRINH-BAY_17.10.2026.docx
+++ b/30-Ket-Qua/2026-10-12/De-Mo-17-10/KICH-BAN-LOI-TRINH-BAY_17.10.2026.docx
@@ -534,7 +534,7 @@
                 <w:i w:val="0"/>
                 <w:sz w:val="26"/>
               </w:rPr>
-              <w:t>Video T1 (50 giây)</w:t>
+              <w:t>Video T1 (01 phút 43 giây)</w:t>
             </w:r>
           </w:p>
         </w:tc>
@@ -554,7 +554,7 @@
                 <w:i w:val="0"/>
                 <w:sz w:val="26"/>
               </w:rPr>
-              <w:t>Không nói - video có giọng thuyết minh suốt: Chọn thư mục dữ liệu, giao việc, công cụ làm việc, cuối video là tệp kết quả.</w:t>
+              <w:t>Không nói - video có giọng thuyết minh suốt: Chọn thư mục dữ liệu, giao việc, công cụ làm việc, rồi chiếu lần lượt 03 trang dự thảo kế hoạch và bảng kiểm hồ sơ, có lời mô tả từng trang.</w:t>
             </w:r>
           </w:p>
         </w:tc>
@@ -576,7 +576,7 @@
                 <w:i w:val="0"/>
                 <w:sz w:val="26"/>
               </w:rPr>
-              <w:t>01:15</w:t>
+              <w:t>02:15</w:t>
             </w:r>
           </w:p>
         </w:tc>
@@ -616,7 +616,7 @@
                 <w:i w:val="0"/>
                 <w:sz w:val="26"/>
               </w:rPr>
-              <w:t>Chỉ 03 điểm: (1) Phòng Nghiệp vụ 2 nộp nhầm mẫu kế hoạch tháng - công cụ còn dẫn đúng Thông báo kết luận yêu cầu nộp kế hoạch quý; (2) hai cặp nhiệm vụ trùng giữa các đơn vị; (3) nhiệm vụ thiếu thời hạn - công cụ tự đề xuất tháng 11 vì công văn cấp trên yêu cầu báo cáo trước 30/11.</w:t>
+              <w:t>Nhấn lại nhanh 03 điểm video vừa nêu: (1) Phòng Nghiệp vụ 2 nộp nhầm mẫu kế hoạch tháng - công cụ còn dẫn đúng Thông báo kết luận yêu cầu nộp kế hoạch quý; (2) hai cặp nhiệm vụ trùng giữa các đơn vị; (3) nhiệm vụ thiếu thời hạn - công cụ tự đề xuất tháng 11 vì công văn cấp trên yêu cầu báo cáo trước 30/11.</w:t>
             </w:r>
           </w:p>
         </w:tc>
@@ -638,7 +638,7 @@
                 <w:i w:val="0"/>
                 <w:sz w:val="26"/>
               </w:rPr>
-              <w:t>03:00</w:t>
+              <w:t>03:15</w:t>
             </w:r>
           </w:p>
         </w:tc>
@@ -720,7 +720,7 @@
                 <w:i w:val="0"/>
                 <w:sz w:val="26"/>
               </w:rPr>
-              <w:t>Trang trình chiếu 4, Video T2 (40 giây, cuối video là bảng đối chiếu)</w:t>
+              <w:t>Trang trình chiếu 4, Video T2 (01 phút 08 giây, cuối video chiếu bảng đối chiếu có lời mô tả)</w:t>
             </w:r>
           </w:p>
         </w:tc>
@@ -762,7 +762,7 @@
                 <w:i w:val="0"/>
                 <w:sz w:val="26"/>
               </w:rPr>
-              <w:t>04:45</w:t>
+              <w:t>05:00</w:t>
             </w:r>
           </w:p>
         </w:tc>
@@ -1135,7 +1135,7 @@
                 <w:i w:val="0"/>
                 <w:sz w:val="26"/>
               </w:rPr>
-              <w:t>Video T3 (47 giây)</w:t>
+              <w:t>Video T3 (01 phút 56 giây)</w:t>
             </w:r>
           </w:p>
         </w:tc>
@@ -1155,7 +1155,7 @@
                 <w:i w:val="0"/>
                 <w:sz w:val="26"/>
               </w:rPr>
-              <w:t>Không nói - video có giọng thuyết minh; cuối video là dự thảo báo cáo và phụ lục đối chiếu.</w:t>
+              <w:t>Không nói - video có giọng thuyết minh; phần sau chiếu lần lượt 03 trang dự thảo báo cáo và 02 trang phụ lục đối chiếu, có lời mô tả từng trang.</w:t>
             </w:r>
           </w:p>
         </w:tc>
@@ -1177,7 +1177,7 @@
                 <w:i w:val="0"/>
                 <w:sz w:val="26"/>
               </w:rPr>
-              <w:t>01:15</w:t>
+              <w:t>02:30</w:t>
             </w:r>
           </w:p>
         </w:tc>
@@ -1217,7 +1217,7 @@
                 <w:i w:val="0"/>
                 <w:sz w:val="26"/>
               </w:rPr>
-              <w:t>Chỉ 03 điểm: (1) 03 nhiệm vụ chưa có trong báo cáo - công cụ ghi “chưa có thông tin”, không kết luận “chưa làm”; (2) tự nhận ra 02 việc tồn từ tháng 8; (3) số liệu hai đơn vị lệch nhau 112 và 120 lượt người.</w:t>
+              <w:t>Nhấn lại nhanh 03 điểm video vừa nêu: (1) 03 nhiệm vụ chưa có trong báo cáo - công cụ ghi “chưa có thông tin”, không kết luận “chưa làm”; (2) tự nhận ra 02 việc tồn từ tháng 8; (3) số liệu hai đơn vị lệch nhau 112 và 120 lượt người.</w:t>
             </w:r>
           </w:p>
         </w:tc>
@@ -1239,7 +1239,7 @@
                 <w:i w:val="0"/>
                 <w:sz w:val="26"/>
               </w:rPr>
-              <w:t>03:30</w:t>
+              <w:t>04:00</w:t>
             </w:r>
           </w:p>
         </w:tc>
@@ -1550,7 +1550,7 @@
                 <w:i w:val="0"/>
                 <w:sz w:val="26"/>
               </w:rPr>
-              <w:t>Trang trình chiếu 6, Video T4 (02 phút 21 giây)</w:t>
+              <w:t>Trang trình chiếu 6, Video T4 (02 phút 15 giây)</w:t>
             </w:r>
           </w:p>
         </w:tc>

</xml_diff>

<commit_message>
feat(demo 17/10): đổi giọng thuyết minh sang giọng nam (Video 1 bản 3, T1–T4); công cụ chèn hình người trình bày kèm sóng âm
Co-Authored-By: Claude Opus 5.5 <noreply@anthropic.com>
</commit_message>
<xml_diff>
--- a/30-Ket-Qua/2026-10-12/De-Mo-17-10/KICH-BAN-LOI-TRINH-BAY_17.10.2026.docx
+++ b/30-Ket-Qua/2026-10-12/De-Mo-17-10/KICH-BAN-LOI-TRINH-BAY_17.10.2026.docx
@@ -305,7 +305,7 @@
                 <w:i w:val="0"/>
                 <w:sz w:val="26"/>
               </w:rPr>
-              <w:t>Video 1 (03 phút 44 giây)</w:t>
+              <w:t>Video 1 (03 phút 42 giây)</w:t>
             </w:r>
           </w:p>
         </w:tc>
@@ -1550,7 +1550,7 @@
                 <w:i w:val="0"/>
                 <w:sz w:val="26"/>
               </w:rPr>
-              <w:t>Trang trình chiếu 6, Video T4 (02 phút 15 giây)</w:t>
+              <w:t>Trang trình chiếu 6, Video T4 (02 phút 17 giây)</w:t>
             </w:r>
           </w:p>
         </w:tc>

</xml_diff>

<commit_message>
feat(demo 17/10): trở lại giọng nữ; khung hình người trình bày nhỏ, đổi vị trí theo phân cảnh (trang kết quả chừa cột phải)
Co-Authored-By: Claude Opus 5.5 <noreply@anthropic.com>
</commit_message>
<xml_diff>
--- a/30-Ket-Qua/2026-10-12/De-Mo-17-10/KICH-BAN-LOI-TRINH-BAY_17.10.2026.docx
+++ b/30-Ket-Qua/2026-10-12/De-Mo-17-10/KICH-BAN-LOI-TRINH-BAY_17.10.2026.docx
@@ -305,7 +305,7 @@
                 <w:i w:val="0"/>
                 <w:sz w:val="26"/>
               </w:rPr>
-              <w:t>Video 1 (03 phút 42 giây)</w:t>
+              <w:t>Video 1 (03 phút 44 giây)</w:t>
             </w:r>
           </w:p>
         </w:tc>
@@ -1550,7 +1550,7 @@
                 <w:i w:val="0"/>
                 <w:sz w:val="26"/>
               </w:rPr>
-              <w:t>Trang trình chiếu 6, Video T4 (02 phút 17 giây)</w:t>
+              <w:t>Trang trình chiếu 6, Video T4 (02 phút 15 giây)</w:t>
             </w:r>
           </w:p>
         </w:tc>

</xml_diff>

<commit_message>
feat(demo 17/10): video toàn bộ 17 phút (trang trình chiếu có lời, thẻ chuyển phần, hỏi - đáp, hai giọng nam nữ); T1–T3 luân phiên giọng nam, nữ
Co-Authored-By: Claude Opus 5.5 <noreply@anthropic.com>
</commit_message>
<xml_diff>
--- a/30-Ket-Qua/2026-10-12/De-Mo-17-10/KICH-BAN-LOI-TRINH-BAY_17.10.2026.docx
+++ b/30-Ket-Qua/2026-10-12/De-Mo-17-10/KICH-BAN-LOI-TRINH-BAY_17.10.2026.docx
@@ -52,6 +52,21 @@
           <w:sz w:val="28"/>
         </w:rPr>
         <w:t>Người trình bày: Đồng chí Nguyễn Ngọc Quang Phục. Người thao tác máy: Đồng chí Đỗ Thành Công. Mọi tệp nằm trong thư mục BAN-TRINH-DIEN-17-10, đánh số theo thứ tự mở. Lời nói dưới đây là gợi ý, người trình bày nói theo cách của mình.</w:t>
+      </w:r>
+    </w:p>
+    <w:p>
+      <w:pPr>
+        <w:spacing w:after="120" w:before="0"/>
+        <w:ind w:firstLine="720"/>
+        <w:jc w:val="both"/>
+      </w:pPr>
+      <w:r>
+        <w:rPr>
+          <w:b w:val="0"/>
+          <w:i w:val="0"/>
+          <w:sz w:val="28"/>
+        </w:rPr>
+        <w:t>Phương án tự chạy: Tệp A_VIDEO-TOAN-BO trong cùng thư mục (17 phút 11 giây) đã ghép toàn bộ trang trình chiếu có lời đọc, Video 1, 04 video thao tác, các thẻ chuyển phần và 06 đoạn hỏi - đáp, hai giọng nam, nữ. Mở tệp này thì người trình bày không cần đọc; mốc thời gian từng phần ghi tại tệp A_VIDEO-TOAN-BO_moc-thoi-gian.txt. Kịch bản theo từng phút dưới đây dùng khi trình bày trực tiếp.</w:t>
       </w:r>
     </w:p>
     <w:p>

</xml_diff>

<commit_message>
feat(demo 17/10): video toàn bộ thêm Phần 4 (07 đoạn kết quả thực tế tại Trường, hai giọng xen kẽ); trang kết thúc đổi thành lời cảm ơn, chúc sức khỏe
Co-Authored-By: Claude Opus 5.5 <noreply@anthropic.com>
</commit_message>
<xml_diff>
--- a/30-Ket-Qua/2026-10-12/De-Mo-17-10/KICH-BAN-LOI-TRINH-BAY_17.10.2026.docx
+++ b/30-Ket-Qua/2026-10-12/De-Mo-17-10/KICH-BAN-LOI-TRINH-BAY_17.10.2026.docx
@@ -66,7 +66,7 @@
           <w:i w:val="0"/>
           <w:sz w:val="28"/>
         </w:rPr>
-        <w:t>Phương án tự chạy: Tệp A_VIDEO-TOAN-BO trong cùng thư mục (17 phút 11 giây) đã ghép toàn bộ trang trình chiếu có lời đọc, Video 1, 04 video thao tác, các thẻ chuyển phần và 06 đoạn hỏi - đáp, hai giọng nam, nữ. Mở tệp này thì người trình bày không cần đọc; mốc thời gian từng phần ghi tại tệp A_VIDEO-TOAN-BO_moc-thoi-gian.txt. Kịch bản theo từng phút dưới đây dùng khi trình bày trực tiếp.</w:t>
+        <w:t>Phương án tự chạy: Tệp A_VIDEO-TOAN-BO trong cùng thư mục (24 phút 33 giây) đã ghép toàn bộ trang trình chiếu có lời đọc, Video 1, 04 video thao tác, Phần 4 gồm 07 đoạn quay kết quả thực tế tại Trường, các thẻ chuyển phần và 06 đoạn hỏi - đáp, hai giọng nam, nữ. Mở tệp này thì người trình bày không cần đọc; mốc thời gian từng phần ghi tại tệp A_VIDEO-TOAN-BO_moc-thoi-gian.txt. Kịch bản theo từng phút dưới đây dùng khi trình bày trực tiếp.</w:t>
       </w:r>
     </w:p>
     <w:p>
@@ -2000,7 +2000,7 @@
                 <w:i w:val="0"/>
                 <w:sz w:val="26"/>
               </w:rPr>
-              <w:t>Trường Cao đẳng Kon Tum sẵn sàng chia sẻ, hỗ trợ mọi công cụ khi nhận được thông tin đầu vào và yêu cầu sản phẩm đầu ra. Trân trọng cảm ơn các đồng chí.</w:t>
+              <w:t>Trường Cao đẳng Kon Tum sẵn sàng chia sẻ, hỗ trợ mọi công cụ khi nhận được thông tin đầu vào và yêu cầu sản phẩm đầu ra. Xin trân trọng cảm ơn các đồng chí đã quan tâm theo dõi; kính chúc các đồng chí sức khỏe, hạnh phúc và thành công.</w:t>
             </w:r>
           </w:p>
         </w:tc>

</xml_diff>